<commit_message>
Sửa mẫu hợp đồng (dấu cách, ô ký tên trống), xem trước đúng định dạng, xuất Excel phụ lục chuyển nhượng, chống phóng to trên điện thoại
Co-Authored-By: Claude Opus 5.5 <noreply@anthropic.com>
Claude-Session: https://claude.ai/code/session_01CsMP1aGgLuJ1aQXsTEzKgG
</commit_message>
<xml_diff>
--- a/data/templates/hopdong-chuyennghiep.docx
+++ b/data/templates/hopdong-chuyennghiep.docx
@@ -847,7 +847,7 @@
           <w:color w:val="000000"/>
           <w:rtl w:val="0"/>
         </w:rPr>
-        <w:t xml:space="preserve">Đại diện: (Ông/Bà)</w:t>
+        <w:t xml:space="preserve">Đại diện: (Ông/Bà) </w:t>
       </w:r>
       <w:r>
         <w:rPr>
@@ -1237,7 +1237,7 @@
           <w:color w:val="000000"/>
           <w:rtl w:val="0"/>
         </w:rPr>
-        <w:t xml:space="preserve">{{TU_NGAY}} đến hết ngày</w:t>
+        <w:t xml:space="preserve">{{TU_NGAY}} đến hết ngày </w:t>
       </w:r>
       <w:bookmarkStart w:colFirst="0" w:colLast="0" w:name="bookmark=id.3znysh7" w:id="4"/>
       <w:bookmarkEnd w:id="4"/>
@@ -4672,7 +4672,7 @@
                 <w:color w:val="000000"/>
                 <w:rtl w:val="0"/>
               </w:rPr>
-              <w:t xml:space="preserve">{{DAI_DIEN_BEN_B}}</w:t>
+              <w:t xml:space="preserve">{{DAI_DIEN_BEN_B_KY}}</w:t>
             </w:r>
           </w:p>
         </w:tc>

</xml_diff>